<commit_message>
Translate 22 CV files (both departments) to Uzbek
Translated all section headers, field labels, and standard terms in 22
faculty CV files across two departments:
- 16 CVs from Department of Computer and Software Engineering
- 6 CVs from Department of Mathematical Modeling and Computer Science

Translated headers include: Personal Information, Educational Background,
Professional Career, Professional Memberships, Research Projects, Industry
Collaborations, Patents, Publications, Language Skills, etc.
Content data (names, dates, publications) preserved as-is.

Co-Authored-By: Claude Opus 4.6 <noreply@anthropic.com>
Claude-Session: https://claude.ai/code/session_01N9ZP28hxEfPoWHf2qaE8QM
</commit_message>
<xml_diff>
--- a/Computer Engineering, Software Engineering, Computer systems & their softwares/Annexes/CVs/CV_Department of Computer and software engineering/CV_Abdualimov_Dilshood.docx
+++ b/Computer Engineering, Software Engineering, Computer systems & their softwares/Annexes/CVs/CV_Department of Computer and software engineering/CV_Abdualimov_Dilshood.docx
@@ -52,7 +52,7 @@
                 <w:iCs/>
                 <w:lang w:val="en-GB"/>
               </w:rPr>
-              <w:t>PERSONAL INFORMATION</w:t>
+              <w:t>SHAXSIY MA'LUMOTLAR</w:t>
             </w:r>
           </w:p>
         </w:tc>
@@ -88,7 +88,7 @@
                 <w:bCs/>
                 <w:lang w:val="en-GB"/>
               </w:rPr>
-              <w:t>Full name</w:t>
+              <w:t>To'liq ism</w:t>
             </w:r>
           </w:p>
         </w:tc>
@@ -159,14 +159,13 @@
                 <w:bCs/>
                 <w:lang w:val="en-GB"/>
               </w:rPr>
-              <w:t>Academic degree and title</w:t>
-            </w:r>
-            <w:r>
-              <w:rPr>
-                <w:rFonts w:asciiTheme="minorBidi" w:hAnsiTheme="minorBidi"/>
-                <w:lang w:val="en-GB"/>
-              </w:rPr>
-              <w:t xml:space="preserve"> </w:t>
+              <w:t>Ilmiy daraja va unvon</w:t>
+            </w:r>
+            <w:r>
+              <w:rPr>
+                <w:rFonts w:asciiTheme="minorBidi" w:hAnsiTheme="minorBidi"/>
+                <w:lang w:val="en-GB"/>
+              </w:rPr>
             </w:r>
           </w:p>
         </w:tc>
@@ -224,7 +223,7 @@
                 <w:b/>
                 <w:bCs/>
               </w:rPr>
-              <w:t>Current Position</w:t>
+              <w:t>Hozirgi lavozim</w:t>
             </w:r>
           </w:p>
         </w:tc>
@@ -306,7 +305,7 @@
                 <w:b/>
                 <w:bCs/>
               </w:rPr>
-              <w:t>Research Field</w:t>
+              <w:t>Tadqiqot sohasi</w:t>
             </w:r>
           </w:p>
         </w:tc>
@@ -380,7 +379,7 @@
                 <w:iCs/>
                 <w:lang w:val="en-GB"/>
               </w:rPr>
-              <w:t>EDUCATIONAL BACKGROUND</w:t>
+              <w:t>TA'LIM MA'LUMOTLARI</w:t>
             </w:r>
           </w:p>
         </w:tc>
@@ -419,7 +418,7 @@
                 <w:iCs/>
                 <w:lang w:val="en-GB"/>
               </w:rPr>
-              <w:t>Degree</w:t>
+              <w:t>Daraja</w:t>
             </w:r>
           </w:p>
         </w:tc>
@@ -455,7 +454,7 @@
                 <w:bCs/>
                 <w:iCs/>
               </w:rPr>
-              <w:t>Program &amp; Qualification</w:t>
+              <w:t>Dastur va malaka</w:t>
             </w:r>
           </w:p>
         </w:tc>
@@ -493,7 +492,7 @@
                 <w:iCs/>
                 <w:lang w:val="en-GB"/>
               </w:rPr>
-              <w:t>HEI</w:t>
+              <w:t>OTM</w:t>
             </w:r>
           </w:p>
         </w:tc>
@@ -529,7 +528,7 @@
                 <w:bCs/>
                 <w:iCs/>
               </w:rPr>
-              <w:t>Year</w:t>
+              <w:t>Yil</w:t>
             </w:r>
           </w:p>
         </w:tc>
@@ -567,7 +566,7 @@
                 <w:bCs/>
                 <w:iCs/>
               </w:rPr>
-              <w:t>Bachelor</w:t>
+              <w:t>Bakalavr</w:t>
             </w:r>
           </w:p>
         </w:tc>
@@ -634,7 +633,7 @@
                 <w:iCs/>
                 <w:lang w:val="en-GB"/>
               </w:rPr>
-              <w:t>Termez State University</w:t>
+              <w:t>Termiz davlat universiteti</w:t>
             </w:r>
           </w:p>
         </w:tc>
@@ -702,7 +701,7 @@
                 <w:bCs/>
                 <w:iCs/>
               </w:rPr>
-              <w:t>Master</w:t>
+              <w:t>Magistr</w:t>
             </w:r>
           </w:p>
         </w:tc>
@@ -767,7 +766,7 @@
                 <w:iCs/>
                 <w:lang w:val="en-GB"/>
               </w:rPr>
-              <w:t>Termez State University</w:t>
+              <w:t>Termiz davlat universiteti</w:t>
             </w:r>
           </w:p>
         </w:tc>
@@ -939,7 +938,7 @@
                 <w:iCs/>
                 <w:lang w:val="en-GB"/>
               </w:rPr>
-              <w:t>Termez State University</w:t>
+              <w:t>Termiz davlat universiteti</w:t>
             </w:r>
           </w:p>
         </w:tc>
@@ -1148,7 +1147,7 @@
                 <w:iCs/>
                 <w:lang w:val="en-GB"/>
               </w:rPr>
-              <w:t>PROFESSIONAL CAREER</w:t>
+              <w:t>KASBIY FAOLIYAT</w:t>
             </w:r>
           </w:p>
         </w:tc>
@@ -1184,7 +1183,7 @@
                 <w:bCs/>
                 <w:lang w:val="sv-SE"/>
               </w:rPr>
-              <w:t>Position</w:t>
+              <w:t>Lavozim</w:t>
             </w:r>
           </w:p>
         </w:tc>
@@ -1220,7 +1219,7 @@
                 <w:bCs/>
                 <w:lang w:val="en-US"/>
               </w:rPr>
-              <w:t>Organization</w:t>
+              <w:t>Tashkilot</w:t>
             </w:r>
           </w:p>
         </w:tc>
@@ -1255,7 +1254,7 @@
                 <w:bCs/>
                 <w:lang w:val="en-US"/>
               </w:rPr>
-              <w:t>Duration</w:t>
+              <w:t>Davr</w:t>
             </w:r>
           </w:p>
         </w:tc>
@@ -1322,7 +1321,7 @@
                 <w:rFonts w:asciiTheme="minorBidi" w:hAnsiTheme="minorBidi"/>
                 <w:lang w:val="en-US"/>
               </w:rPr>
-              <w:t>Termez State University</w:t>
+              <w:t>Termiz davlat universiteti</w:t>
             </w:r>
           </w:p>
         </w:tc>
@@ -1388,7 +1387,7 @@
                 <w:rFonts w:asciiTheme="minorBidi" w:hAnsiTheme="minorBidi"/>
                 <w:lang w:val="en-US"/>
               </w:rPr>
-              <w:t>Teacher</w:t>
+              <w:t>O'qituvchi</w:t>
             </w:r>
           </w:p>
         </w:tc>
@@ -1548,7 +1547,7 @@
                 <w:rFonts w:asciiTheme="minorBidi" w:hAnsiTheme="minorBidi"/>
                 <w:lang w:val="en-US"/>
               </w:rPr>
-              <w:t>Termez State University</w:t>
+              <w:t>Termiz davlat universiteti</w:t>
             </w:r>
           </w:p>
         </w:tc>
@@ -1620,7 +1619,7 @@
                 <w:bCs/>
                 <w:iCs/>
               </w:rPr>
-              <w:t>PROFESSIONAL MEMBERSHIPS &amp; SCIENTIFIC ACTIVITY</w:t>
+              <w:t>KASBIY A'ZOLIKLAR VA ILMIY FAOLIYAT</w:t>
             </w:r>
           </w:p>
         </w:tc>
@@ -1655,7 +1654,7 @@
                 <w:b/>
                 <w:bCs/>
               </w:rPr>
-              <w:t>Organization</w:t>
+              <w:t>Tashkilot</w:t>
             </w:r>
           </w:p>
         </w:tc>
@@ -1691,7 +1690,7 @@
                 <w:b/>
                 <w:bCs/>
               </w:rPr>
-              <w:t>Position</w:t>
+              <w:t>Lavozim</w:t>
             </w:r>
           </w:p>
         </w:tc>
@@ -1727,7 +1726,7 @@
                 <w:b/>
                 <w:bCs/>
               </w:rPr>
-              <w:t>Year</w:t>
+              <w:t>Yil</w:t>
             </w:r>
           </w:p>
         </w:tc>
@@ -1853,7 +1852,7 @@
                 <w:b/>
                 <w:bCs/>
               </w:rPr>
-              <w:t xml:space="preserve">RESEARCH AND DEVELOPMENT PROJECTS (LAST 5 YEARS) </w:t>
+              <w:t>TADQIQOT VA ISHLAB CHIQISH LOYIHALARI (SO'NGGI 5 YIL)</w:t>
             </w:r>
           </w:p>
         </w:tc>
@@ -1926,7 +1925,7 @@
                 <w:b/>
                 <w:bCs/>
               </w:rPr>
-              <w:t>INDUSTRY COLLABORATIONS (LAST 5 YEARS)</w:t>
+              <w:t>SANOAT HAMKORLIKLARI (SO'NGGI 5 YIL)</w:t>
             </w:r>
           </w:p>
         </w:tc>
@@ -1998,7 +1997,7 @@
                 <w:b/>
                 <w:bCs/>
               </w:rPr>
-              <w:t>PATENTS AND INTELLECTUAL PROPERTY RIGHTS</w:t>
+              <w:t>PATENTLAR VA INTELLEKTUAL MULK HUQUQLARI</w:t>
             </w:r>
           </w:p>
         </w:tc>
@@ -2072,7 +2071,7 @@
                 <w:b/>
                 <w:bCs/>
               </w:rPr>
-              <w:t>SCIENTIFIC ARTICLES AND PUBLICATIONS (LAST 5 YEARS)</w:t>
+              <w:t>ILMIY MAQOLALAR VA NASHRLAR (SO'NGGI 5 YIL)</w:t>
             </w:r>
           </w:p>
         </w:tc>

</xml_diff>